<commit_message>
fix: add NABL/ISO 15189 and Indian EQA providers alongside CLSI C24 (AAC7)
CLSI C24 (US) was the only cited IQC standard, and the PT/EQA step
named no Indian scheme. Added a note pointing to NABL/ISO 15189 as the
equally acceptable Indian basis, and updated the EQA enrolment step to
name NABL-recognised/Indian providers (e.g. CMC Vellore EQAS, AIIMS
EQAS) alongside international schemes.

Co-Authored-By: Claude Sonnet 5 <noreply@anthropic.com>
Claude-Session: https://claude.ai/code/session_01TPRLtLhmTCP5z94Q3FiE5v
</commit_message>
<xml_diff>
--- a/policies/build/chapters_v2/AAC/document/AAC7/SOP_IQC_ResultRelease.docx
+++ b/policies/build/chapters_v2/AAC/document/AAC7/SOP_IQC_ResultRelease.docx
@@ -321,18 +321,12 @@
     </w:p>
     <w:p>
       <w:r>
-        <w:t xml:space="preserve">Laboratory Technologist: </w:t>
-      </w:r>
-      <w:r>
-        <w:t>runs IQC per the defined schedule and checks results before releasing any patient result for that run.</w:t>
+        <w:t xml:space="preserve">Laboratory Technologist: runs IQC per the defined schedule and checks results before releasing any patient result for that run.</w:t>
       </w:r>
     </w:p>
     <w:p>
       <w:r>
-        <w:t xml:space="preserve">Laboratory In-Charge / Supervising Specialist: </w:t>
-      </w:r>
-      <w:r>
-        <w:t>authorises any override when IQC fails, with documented justification.</w:t>
+        <w:t xml:space="preserve">Laboratory In-Charge / Supervising Specialist: authorises any override when IQC fails, with documented justification.</w:t>
       </w:r>
     </w:p>
     <w:p>
@@ -429,6 +423,14 @@
     </w:p>
     <w:p>
       <w:pPr>
+        <w:pStyle w:val="ListParagraph"/>
+      </w:pPr>
+      <w:r>
+        <w:t>Note: CLSI C24 is cited for IQC design/interpretation technique only. NABH does not mandate this specific guideline — ISO 15189 (the standard NABL accreditation is based on) and the hospital’s own validated IQC protocol are equally acceptable.</w:t>
+      </w:r>
+    </w:p>
+    <w:p>
+      <w:pPr>
         <w:pStyle w:val="Heading2"/>
       </w:pPr>
       <w:r>
@@ -514,7 +516,7 @@
     </w:p>
     <w:p>
       <w:r>
-        <w:t>1. Enrol in PT/EQA schemes for every analyte where a formal programme exists and the laboratory performs the test.</w:t>
+        <w:t>1. Enrol in PT/EQA schemes for every analyte where a formal programme exists and the laboratory performs the test — preferably an EQAS run by an NABL-recognised or Indian provider (e.g. CMC Vellore EQAS, AIIMS EQAS) where available, alongside or instead of an international scheme.</w:t>
       </w:r>
     </w:p>
     <w:p>

</xml_diff>